<commit_message>
Checking in AWS Gen AI Developer Pro prep documentation
</commit_message>
<xml_diff>
--- a/ml-research-learnings/docs/My Notes/AWS Gen AI Pro Exam Prep Notes - Udemy.docx
+++ b/ml-research-learnings/docs/My Notes/AWS Gen AI Pro Exam Prep Notes - Udemy.docx
@@ -13432,7 +13432,7 @@
           <w:szCs w:val="28"/>
         </w:rPr>
         <w:pict w14:anchorId="0362B6D2">
-          <v:rect id="_x0000_i1115" style="width:0;height:1.5pt" o:hralign="center" o:hrstd="t" o:hr="t" fillcolor="#a0a0a0" stroked="f"/>
+          <v:rect id="_x0000_i1025" style="width:0;height:1.5pt" o:hralign="center" o:hrstd="t" o:hr="t" fillcolor="#a0a0a0" stroked="f"/>
         </w:pict>
       </w:r>
     </w:p>
@@ -14548,16 +14548,7 @@
           <w:sz w:val="28"/>
           <w:szCs w:val="28"/>
         </w:rPr>
-        <w:t>Architecture</w:t>
-      </w:r>
-      <w:r>
-        <w:rPr>
-          <w:b/>
-          <w:bCs/>
-          <w:sz w:val="28"/>
-          <w:szCs w:val="28"/>
-        </w:rPr>
-        <w:t xml:space="preserve"> </w:t>
+        <w:t xml:space="preserve">Architecture </w:t>
       </w:r>
     </w:p>
     <w:p>
@@ -14697,16 +14688,7 @@
           <w:sz w:val="28"/>
           <w:szCs w:val="28"/>
         </w:rPr>
-        <w:t>Database</w:t>
-      </w:r>
-      <w:r>
-        <w:rPr>
-          <w:b/>
-          <w:bCs/>
-          <w:sz w:val="28"/>
-          <w:szCs w:val="28"/>
-        </w:rPr>
-        <w:t xml:space="preserve"> </w:t>
+        <w:t xml:space="preserve">Database </w:t>
       </w:r>
     </w:p>
     <w:p>
@@ -17481,7 +17463,7 @@
           <w:szCs w:val="28"/>
         </w:rPr>
         <w:pict w14:anchorId="25C08DFA">
-          <v:rect id="_x0000_i1404" style="width:0;height:1.5pt" o:hralign="center" o:hrstd="t" o:hr="t" fillcolor="#a0a0a0" stroked="f"/>
+          <v:rect id="_x0000_i1026" style="width:0;height:1.5pt" o:hralign="center" o:hrstd="t" o:hr="t" fillcolor="#a0a0a0" stroked="f"/>
         </w:pict>
       </w:r>
     </w:p>
@@ -17588,16 +17570,7 @@
           <w:sz w:val="28"/>
           <w:szCs w:val="28"/>
         </w:rPr>
-        <w:t>Architecture</w:t>
-      </w:r>
-      <w:r>
-        <w:rPr>
-          <w:b/>
-          <w:bCs/>
-          <w:sz w:val="28"/>
-          <w:szCs w:val="28"/>
-        </w:rPr>
-        <w:t xml:space="preserve"> </w:t>
+        <w:t xml:space="preserve">Architecture </w:t>
       </w:r>
     </w:p>
     <w:p>
@@ -17697,16 +17670,7 @@
           <w:sz w:val="28"/>
           <w:szCs w:val="28"/>
         </w:rPr>
-        <w:t>Generated Response</w:t>
-      </w:r>
-      <w:r>
-        <w:rPr>
-          <w:b/>
-          <w:bCs/>
-          <w:sz w:val="28"/>
-          <w:szCs w:val="28"/>
-        </w:rPr>
-        <w:t xml:space="preserve"> </w:t>
+        <w:t xml:space="preserve">Generated Response </w:t>
       </w:r>
     </w:p>
     <w:p>
@@ -17775,7 +17739,7 @@
           <w:szCs w:val="28"/>
         </w:rPr>
         <w:pict w14:anchorId="5D52AE96">
-          <v:rect id="_x0000_i1448" style="width:0;height:1.5pt" o:hralign="center" o:hrstd="t" o:hr="t" fillcolor="#a0a0a0" stroked="f"/>
+          <v:rect id="_x0000_i1027" style="width:0;height:1.5pt" o:hralign="center" o:hrstd="t" o:hr="t" fillcolor="#a0a0a0" stroked="f"/>
         </w:pict>
       </w:r>
     </w:p>
@@ -17826,7 +17790,7 @@
           <w:szCs w:val="28"/>
         </w:rPr>
         <w:pict w14:anchorId="48009665">
-          <v:rect id="_x0000_i1449" style="width:0;height:1.5pt" o:hralign="center" o:hrstd="t" o:hr="t" fillcolor="#a0a0a0" stroked="f"/>
+          <v:rect id="_x0000_i1028" style="width:0;height:1.5pt" o:hralign="center" o:hrstd="t" o:hr="t" fillcolor="#a0a0a0" stroked="f"/>
         </w:pict>
       </w:r>
     </w:p>
@@ -17878,7 +17842,7 @@
         </w:rPr>
         <w:lastRenderedPageBreak/>
         <w:pict w14:anchorId="59967BBA">
-          <v:rect id="_x0000_i1450" style="width:0;height:1.5pt" o:hralign="center" o:hrstd="t" o:hr="t" fillcolor="#a0a0a0" stroked="f"/>
+          <v:rect id="_x0000_i1029" style="width:0;height:1.5pt" o:hralign="center" o:hrstd="t" o:hr="t" fillcolor="#a0a0a0" stroked="f"/>
         </w:pict>
       </w:r>
     </w:p>
@@ -17929,7 +17893,7 @@
           <w:szCs w:val="28"/>
         </w:rPr>
         <w:pict w14:anchorId="7D158301">
-          <v:rect id="_x0000_i1451" style="width:0;height:1.5pt" o:hralign="center" o:hrstd="t" o:hr="t" fillcolor="#a0a0a0" stroked="f"/>
+          <v:rect id="_x0000_i1030" style="width:0;height:1.5pt" o:hralign="center" o:hrstd="t" o:hr="t" fillcolor="#a0a0a0" stroked="f"/>
         </w:pict>
       </w:r>
     </w:p>
@@ -17980,7 +17944,7 @@
           <w:szCs w:val="28"/>
         </w:rPr>
         <w:pict w14:anchorId="3D4FC7E8">
-          <v:rect id="_x0000_i1452" style="width:0;height:1.5pt" o:hralign="center" o:hrstd="t" o:hr="t" fillcolor="#a0a0a0" stroked="f"/>
+          <v:rect id="_x0000_i1031" style="width:0;height:1.5pt" o:hralign="center" o:hrstd="t" o:hr="t" fillcolor="#a0a0a0" stroked="f"/>
         </w:pict>
       </w:r>
     </w:p>
@@ -18201,7 +18165,7 @@
           <w:szCs w:val="28"/>
         </w:rPr>
         <w:pict w14:anchorId="38B4E394">
-          <v:rect id="_x0000_i1453" style="width:0;height:1.5pt" o:hralign="center" o:hrstd="t" o:hr="t" fillcolor="#a0a0a0" stroked="f"/>
+          <v:rect id="_x0000_i1032" style="width:0;height:1.5pt" o:hralign="center" o:hrstd="t" o:hr="t" fillcolor="#a0a0a0" stroked="f"/>
         </w:pict>
       </w:r>
     </w:p>
@@ -18386,7 +18350,7 @@
           <w:szCs w:val="28"/>
         </w:rPr>
         <w:pict w14:anchorId="0E8B6582">
-          <v:rect id="_x0000_i1454" style="width:0;height:1.5pt" o:hralign="center" o:hrstd="t" o:hr="t" fillcolor="#a0a0a0" stroked="f"/>
+          <v:rect id="_x0000_i1033" style="width:0;height:1.5pt" o:hralign="center" o:hrstd="t" o:hr="t" fillcolor="#a0a0a0" stroked="f"/>
         </w:pict>
       </w:r>
     </w:p>
@@ -18668,7 +18632,7 @@
           <w:szCs w:val="28"/>
         </w:rPr>
         <w:pict w14:anchorId="63D486D1">
-          <v:rect id="_x0000_i1468" style="width:0;height:1.5pt" o:hralign="center" o:hrstd="t" o:hr="t" fillcolor="#a0a0a0" stroked="f"/>
+          <v:rect id="_x0000_i1034" style="width:0;height:1.5pt" o:hralign="center" o:hrstd="t" o:hr="t" fillcolor="#a0a0a0" stroked="f"/>
         </w:pict>
       </w:r>
     </w:p>
@@ -18779,16 +18743,7 @@
           <w:sz w:val="28"/>
           <w:szCs w:val="28"/>
         </w:rPr>
-        <w:t>Architecture</w:t>
-      </w:r>
-      <w:r>
-        <w:rPr>
-          <w:b/>
-          <w:bCs/>
-          <w:sz w:val="28"/>
-          <w:szCs w:val="28"/>
-        </w:rPr>
-        <w:t xml:space="preserve"> </w:t>
+        <w:t xml:space="preserve">Architecture </w:t>
       </w:r>
     </w:p>
     <w:p>
@@ -19008,16 +18963,7 @@
           <w:sz w:val="28"/>
           <w:szCs w:val="28"/>
         </w:rPr>
-        <w:t>Grounded Answer</w:t>
-      </w:r>
-      <w:r>
-        <w:rPr>
-          <w:b/>
-          <w:bCs/>
-          <w:sz w:val="28"/>
-          <w:szCs w:val="28"/>
-        </w:rPr>
-        <w:t xml:space="preserve"> </w:t>
+        <w:t xml:space="preserve">Grounded Answer </w:t>
       </w:r>
     </w:p>
     <w:p>
@@ -19208,7 +19154,7 @@
           <w:szCs w:val="28"/>
         </w:rPr>
         <w:pict w14:anchorId="3784780B">
-          <v:rect id="_x0000_i1500" style="width:0;height:1.5pt" o:hralign="center" o:hrstd="t" o:hr="t" fillcolor="#a0a0a0" stroked="f"/>
+          <v:rect id="_x0000_i1035" style="width:0;height:1.5pt" o:hralign="center" o:hrstd="t" o:hr="t" fillcolor="#a0a0a0" stroked="f"/>
         </w:pict>
       </w:r>
     </w:p>
@@ -19259,7 +19205,7 @@
           <w:szCs w:val="28"/>
         </w:rPr>
         <w:pict w14:anchorId="6FFE0EC4">
-          <v:rect id="_x0000_i1501" style="width:0;height:1.5pt" o:hralign="center" o:hrstd="t" o:hr="t" fillcolor="#a0a0a0" stroked="f"/>
+          <v:rect id="_x0000_i1036" style="width:0;height:1.5pt" o:hralign="center" o:hrstd="t" o:hr="t" fillcolor="#a0a0a0" stroked="f"/>
         </w:pict>
       </w:r>
     </w:p>
@@ -19310,7 +19256,7 @@
           <w:szCs w:val="28"/>
         </w:rPr>
         <w:pict w14:anchorId="00896E11">
-          <v:rect id="_x0000_i1502" style="width:0;height:1.5pt" o:hralign="center" o:hrstd="t" o:hr="t" fillcolor="#a0a0a0" stroked="f"/>
+          <v:rect id="_x0000_i1037" style="width:0;height:1.5pt" o:hralign="center" o:hrstd="t" o:hr="t" fillcolor="#a0a0a0" stroked="f"/>
         </w:pict>
       </w:r>
     </w:p>
@@ -19361,7 +19307,7 @@
           <w:szCs w:val="28"/>
         </w:rPr>
         <w:pict w14:anchorId="33503534">
-          <v:rect id="_x0000_i1503" style="width:0;height:1.5pt" o:hralign="center" o:hrstd="t" o:hr="t" fillcolor="#a0a0a0" stroked="f"/>
+          <v:rect id="_x0000_i1038" style="width:0;height:1.5pt" o:hralign="center" o:hrstd="t" o:hr="t" fillcolor="#a0a0a0" stroked="f"/>
         </w:pict>
       </w:r>
     </w:p>
@@ -19412,7 +19358,7 @@
           <w:szCs w:val="28"/>
         </w:rPr>
         <w:pict w14:anchorId="2715DA1E">
-          <v:rect id="_x0000_i1504" style="width:0;height:1.5pt" o:hralign="center" o:hrstd="t" o:hr="t" fillcolor="#a0a0a0" stroked="f"/>
+          <v:rect id="_x0000_i1039" style="width:0;height:1.5pt" o:hralign="center" o:hrstd="t" o:hr="t" fillcolor="#a0a0a0" stroked="f"/>
         </w:pict>
       </w:r>
     </w:p>
@@ -20568,7 +20514,7 @@
           <w:szCs w:val="28"/>
         </w:rPr>
         <w:pict w14:anchorId="766DF2AF">
-          <v:rect id="_x0000_i1558" style="width:0;height:1.5pt" o:hralign="center" o:hrstd="t" o:hr="t" fillcolor="#a0a0a0" stroked="f"/>
+          <v:rect id="_x0000_i1040" style="width:0;height:1.5pt" o:hralign="center" o:hrstd="t" o:hr="t" fillcolor="#a0a0a0" stroked="f"/>
         </w:pict>
       </w:r>
     </w:p>
@@ -20620,7 +20566,7 @@
           <w:szCs w:val="28"/>
         </w:rPr>
         <w:pict w14:anchorId="7304272F">
-          <v:rect id="_x0000_i1559" style="width:0;height:1.5pt" o:hralign="center" o:hrstd="t" o:hr="t" fillcolor="#a0a0a0" stroked="f"/>
+          <v:rect id="_x0000_i1041" style="width:0;height:1.5pt" o:hralign="center" o:hrstd="t" o:hr="t" fillcolor="#a0a0a0" stroked="f"/>
         </w:pict>
       </w:r>
     </w:p>
@@ -20728,7 +20674,7 @@
           <w:szCs w:val="28"/>
         </w:rPr>
         <w:pict w14:anchorId="01602532">
-          <v:rect id="_x0000_i1560" style="width:0;height:1.5pt" o:hralign="center" o:hrstd="t" o:hr="t" fillcolor="#a0a0a0" stroked="f"/>
+          <v:rect id="_x0000_i1042" style="width:0;height:1.5pt" o:hralign="center" o:hrstd="t" o:hr="t" fillcolor="#a0a0a0" stroked="f"/>
         </w:pict>
       </w:r>
     </w:p>
@@ -20779,7 +20725,7 @@
           <w:szCs w:val="28"/>
         </w:rPr>
         <w:pict w14:anchorId="607FB106">
-          <v:rect id="_x0000_i1561" style="width:0;height:1.5pt" o:hralign="center" o:hrstd="t" o:hr="t" fillcolor="#a0a0a0" stroked="f"/>
+          <v:rect id="_x0000_i1043" style="width:0;height:1.5pt" o:hralign="center" o:hrstd="t" o:hr="t" fillcolor="#a0a0a0" stroked="f"/>
         </w:pict>
       </w:r>
     </w:p>
@@ -20830,7 +20776,7 @@
           <w:szCs w:val="28"/>
         </w:rPr>
         <w:pict w14:anchorId="1DB7266C">
-          <v:rect id="_x0000_i1562" style="width:0;height:1.5pt" o:hralign="center" o:hrstd="t" o:hr="t" fillcolor="#a0a0a0" stroked="f"/>
+          <v:rect id="_x0000_i1044" style="width:0;height:1.5pt" o:hralign="center" o:hrstd="t" o:hr="t" fillcolor="#a0a0a0" stroked="f"/>
         </w:pict>
       </w:r>
     </w:p>
@@ -21002,7 +20948,7 @@
           <w:szCs w:val="28"/>
         </w:rPr>
         <w:pict w14:anchorId="1649CA1D">
-          <v:rect id="_x0000_i1563" style="width:0;height:1.5pt" o:hralign="center" o:hrstd="t" o:hr="t" fillcolor="#a0a0a0" stroked="f"/>
+          <v:rect id="_x0000_i1045" style="width:0;height:1.5pt" o:hralign="center" o:hrstd="t" o:hr="t" fillcolor="#a0a0a0" stroked="f"/>
         </w:pict>
       </w:r>
     </w:p>
@@ -21187,7 +21133,7 @@
           <w:szCs w:val="28"/>
         </w:rPr>
         <w:pict w14:anchorId="27DB7BF3">
-          <v:rect id="_x0000_i1564" style="width:0;height:1.5pt" o:hralign="center" o:hrstd="t" o:hr="t" fillcolor="#a0a0a0" stroked="f"/>
+          <v:rect id="_x0000_i1046" style="width:0;height:1.5pt" o:hralign="center" o:hrstd="t" o:hr="t" fillcolor="#a0a0a0" stroked="f"/>
         </w:pict>
       </w:r>
     </w:p>
@@ -21390,7 +21336,7 @@
           <w:szCs w:val="28"/>
         </w:rPr>
         <w:pict w14:anchorId="2A2EE2B5">
-          <v:rect id="_x0000_i1565" style="width:0;height:1.5pt" o:hralign="center" o:hrstd="t" o:hr="t" fillcolor="#a0a0a0" stroked="f"/>
+          <v:rect id="_x0000_i1047" style="width:0;height:1.5pt" o:hralign="center" o:hrstd="t" o:hr="t" fillcolor="#a0a0a0" stroked="f"/>
         </w:pict>
       </w:r>
     </w:p>
@@ -21870,7 +21816,7 @@
           <w:szCs w:val="28"/>
         </w:rPr>
         <w:pict w14:anchorId="7616E3B4">
-          <v:rect id="_x0000_i1580" style="width:0;height:1.5pt" o:hralign="center" o:hrstd="t" o:hr="t" fillcolor="#a0a0a0" stroked="f"/>
+          <v:rect id="_x0000_i1048" style="width:0;height:1.5pt" o:hralign="center" o:hrstd="t" o:hr="t" fillcolor="#a0a0a0" stroked="f"/>
         </w:pict>
       </w:r>
     </w:p>
@@ -21886,14 +21832,7 @@
           <w:sz w:val="28"/>
           <w:szCs w:val="28"/>
         </w:rPr>
-        <w:t>Architecture</w:t>
-      </w:r>
-      <w:r>
-        <w:rPr>
-          <w:sz w:val="28"/>
-          <w:szCs w:val="28"/>
-        </w:rPr>
-        <w:t xml:space="preserve"> </w:t>
+        <w:t xml:space="preserve">Architecture </w:t>
       </w:r>
     </w:p>
     <w:p>
@@ -22070,14 +22009,7 @@
           <w:sz w:val="28"/>
           <w:szCs w:val="28"/>
         </w:rPr>
-        <w:t>Adaptive Replanning</w:t>
-      </w:r>
-      <w:r>
-        <w:rPr>
-          <w:sz w:val="28"/>
-          <w:szCs w:val="28"/>
-        </w:rPr>
-        <w:t xml:space="preserve"> </w:t>
+        <w:t xml:space="preserve">Adaptive Replanning </w:t>
       </w:r>
     </w:p>
     <w:p>
@@ -22146,7 +22078,7 @@
           <w:szCs w:val="28"/>
         </w:rPr>
         <w:pict w14:anchorId="5899BCF1">
-          <v:rect id="_x0000_i1612" style="width:0;height:1.5pt" o:hralign="center" o:hrstd="t" o:hr="t" fillcolor="#a0a0a0" stroked="f"/>
+          <v:rect id="_x0000_i1049" style="width:0;height:1.5pt" o:hralign="center" o:hrstd="t" o:hr="t" fillcolor="#a0a0a0" stroked="f"/>
         </w:pict>
       </w:r>
     </w:p>
@@ -22197,7 +22129,7 @@
           <w:szCs w:val="28"/>
         </w:rPr>
         <w:pict w14:anchorId="1CF2597F">
-          <v:rect id="_x0000_i1613" style="width:0;height:1.5pt" o:hralign="center" o:hrstd="t" o:hr="t" fillcolor="#a0a0a0" stroked="f"/>
+          <v:rect id="_x0000_i1050" style="width:0;height:1.5pt" o:hralign="center" o:hrstd="t" o:hr="t" fillcolor="#a0a0a0" stroked="f"/>
         </w:pict>
       </w:r>
     </w:p>
@@ -22248,7 +22180,7 @@
           <w:szCs w:val="28"/>
         </w:rPr>
         <w:pict w14:anchorId="18601EDA">
-          <v:rect id="_x0000_i1614" style="width:0;height:1.5pt" o:hralign="center" o:hrstd="t" o:hr="t" fillcolor="#a0a0a0" stroked="f"/>
+          <v:rect id="_x0000_i1051" style="width:0;height:1.5pt" o:hralign="center" o:hrstd="t" o:hr="t" fillcolor="#a0a0a0" stroked="f"/>
         </w:pict>
       </w:r>
     </w:p>
@@ -22376,7 +22308,7 @@
           <w:szCs w:val="28"/>
         </w:rPr>
         <w:pict w14:anchorId="3A8C5023">
-          <v:rect id="_x0000_i1615" style="width:0;height:1.5pt" o:hralign="center" o:hrstd="t" o:hr="t" fillcolor="#a0a0a0" stroked="f"/>
+          <v:rect id="_x0000_i1052" style="width:0;height:1.5pt" o:hralign="center" o:hrstd="t" o:hr="t" fillcolor="#a0a0a0" stroked="f"/>
         </w:pict>
       </w:r>
     </w:p>
@@ -22473,7 +22405,7 @@
           <w:szCs w:val="28"/>
         </w:rPr>
         <w:pict w14:anchorId="33EB185F">
-          <v:rect id="_x0000_i1616" style="width:0;height:1.5pt" o:hralign="center" o:hrstd="t" o:hr="t" fillcolor="#a0a0a0" stroked="f"/>
+          <v:rect id="_x0000_i1053" style="width:0;height:1.5pt" o:hralign="center" o:hrstd="t" o:hr="t" fillcolor="#a0a0a0" stroked="f"/>
         </w:pict>
       </w:r>
     </w:p>
@@ -22947,7 +22879,7 @@
     <w:p>
       <w:r>
         <w:pict w14:anchorId="42C8D86E">
-          <v:rect id="_x0000_i1652" style="width:0;height:1.5pt" o:hralign="center" o:hrstd="t" o:hr="t" fillcolor="#a0a0a0" stroked="f"/>
+          <v:rect id="_x0000_i1054" style="width:0;height:1.5pt" o:hralign="center" o:hrstd="t" o:hr="t" fillcolor="#a0a0a0" stroked="f"/>
         </w:pict>
       </w:r>
     </w:p>
@@ -22974,7 +22906,7 @@
     <w:p>
       <w:r>
         <w:pict w14:anchorId="2E23D25F">
-          <v:rect id="_x0000_i1653" style="width:0;height:1.5pt" o:hralign="center" o:hrstd="t" o:hr="t" fillcolor="#a0a0a0" stroked="f"/>
+          <v:rect id="_x0000_i1055" style="width:0;height:1.5pt" o:hralign="center" o:hrstd="t" o:hr="t" fillcolor="#a0a0a0" stroked="f"/>
         </w:pict>
       </w:r>
     </w:p>
@@ -23001,7 +22933,7 @@
     <w:p>
       <w:r>
         <w:pict w14:anchorId="2F4A5B42">
-          <v:rect id="_x0000_i1654" style="width:0;height:1.5pt" o:hralign="center" o:hrstd="t" o:hr="t" fillcolor="#a0a0a0" stroked="f"/>
+          <v:rect id="_x0000_i1056" style="width:0;height:1.5pt" o:hralign="center" o:hrstd="t" o:hr="t" fillcolor="#a0a0a0" stroked="f"/>
         </w:pict>
       </w:r>
     </w:p>
@@ -23028,7 +22960,7 @@
     <w:p>
       <w:r>
         <w:pict w14:anchorId="529BB729">
-          <v:rect id="_x0000_i1655" style="width:0;height:1.5pt" o:hralign="center" o:hrstd="t" o:hr="t" fillcolor="#a0a0a0" stroked="f"/>
+          <v:rect id="_x0000_i1057" style="width:0;height:1.5pt" o:hralign="center" o:hrstd="t" o:hr="t" fillcolor="#a0a0a0" stroked="f"/>
         </w:pict>
       </w:r>
     </w:p>
@@ -23055,7 +22987,7 @@
     <w:p>
       <w:r>
         <w:pict w14:anchorId="3ACE84F9">
-          <v:rect id="_x0000_i1656" style="width:0;height:1.5pt" o:hralign="center" o:hrstd="t" o:hr="t" fillcolor="#a0a0a0" stroked="f"/>
+          <v:rect id="_x0000_i1058" style="width:0;height:1.5pt" o:hralign="center" o:hrstd="t" o:hr="t" fillcolor="#a0a0a0" stroked="f"/>
         </w:pict>
       </w:r>
     </w:p>
@@ -23849,14 +23781,7 @@
           <w:sz w:val="28"/>
           <w:szCs w:val="28"/>
         </w:rPr>
-        <w:t>Goal-Driven Multi-Agent Systems</w:t>
-      </w:r>
-      <w:r>
-        <w:rPr>
-          <w:sz w:val="28"/>
-          <w:szCs w:val="28"/>
-        </w:rPr>
-        <w:t xml:space="preserve"> </w:t>
+        <w:t xml:space="preserve">Goal-Driven Multi-Agent Systems </w:t>
       </w:r>
     </w:p>
     <w:p>
@@ -29332,7 +29257,7 @@
           <w:szCs w:val="28"/>
         </w:rPr>
         <w:drawing>
-          <wp:inline distT="0" distB="0" distL="0" distR="0" wp14:anchorId="52924A52" wp14:editId="03D47475">
+          <wp:inline distT="0" distB="0" distL="0" distR="0" wp14:anchorId="52924A52" wp14:editId="4BA46958">
             <wp:extent cx="3071701" cy="1730510"/>
             <wp:effectExtent l="0" t="0" r="0" b="3175"/>
             <wp:docPr id="1673396205" name="Picture 7"/>
@@ -29807,7 +29732,7 @@
           <w:szCs w:val="28"/>
         </w:rPr>
         <w:pict w14:anchorId="710857A6">
-          <v:rect id="_x0000_i1025" style="width:0;height:1.5pt" o:hralign="center" o:hrstd="t" o:hr="t" fillcolor="#a0a0a0" stroked="f"/>
+          <v:rect id="_x0000_i1059" style="width:0;height:1.5pt" o:hralign="center" o:hrstd="t" o:hr="t" fillcolor="#a0a0a0" stroked="f"/>
         </w:pict>
       </w:r>
     </w:p>
@@ -33931,7 +33856,7 @@
           <w:szCs w:val="28"/>
         </w:rPr>
         <w:pict w14:anchorId="08A85D2C">
-          <v:rect id="_x0000_i1026" style="width:0;height:1.5pt" o:hralign="center" o:hrstd="t" o:hr="t" fillcolor="#a0a0a0" stroked="f"/>
+          <v:rect id="_x0000_i1060" style="width:0;height:1.5pt" o:hralign="center" o:hrstd="t" o:hr="t" fillcolor="#a0a0a0" stroked="f"/>
         </w:pict>
       </w:r>
     </w:p>
@@ -34025,7 +33950,7 @@
         </w:rPr>
         <w:lastRenderedPageBreak/>
         <w:pict w14:anchorId="3E0B0699">
-          <v:rect id="_x0000_i1027" style="width:0;height:1.5pt" o:hralign="center" o:hrstd="t" o:hr="t" fillcolor="#a0a0a0" stroked="f"/>
+          <v:rect id="_x0000_i1061" style="width:0;height:1.5pt" o:hralign="center" o:hrstd="t" o:hr="t" fillcolor="#a0a0a0" stroked="f"/>
         </w:pict>
       </w:r>
     </w:p>
@@ -34150,7 +34075,7 @@
           <w:szCs w:val="28"/>
         </w:rPr>
         <w:pict w14:anchorId="4808FC77">
-          <v:rect id="_x0000_i1028" style="width:0;height:1.5pt" o:hralign="center" o:hrstd="t" o:hr="t" fillcolor="#a0a0a0" stroked="f"/>
+          <v:rect id="_x0000_i1062" style="width:0;height:1.5pt" o:hralign="center" o:hrstd="t" o:hr="t" fillcolor="#a0a0a0" stroked="f"/>
         </w:pict>
       </w:r>
     </w:p>
@@ -34259,7 +34184,7 @@
           <w:szCs w:val="28"/>
         </w:rPr>
         <w:pict w14:anchorId="1BCA35C1">
-          <v:rect id="_x0000_i1029" style="width:0;height:1.5pt" o:hralign="center" o:hrstd="t" o:hr="t" fillcolor="#a0a0a0" stroked="f"/>
+          <v:rect id="_x0000_i1063" style="width:0;height:1.5pt" o:hralign="center" o:hrstd="t" o:hr="t" fillcolor="#a0a0a0" stroked="f"/>
         </w:pict>
       </w:r>
     </w:p>
@@ -34364,7 +34289,7 @@
           <w:szCs w:val="28"/>
         </w:rPr>
         <w:pict w14:anchorId="377CDC65">
-          <v:rect id="_x0000_i1030" style="width:0;height:1.5pt" o:hralign="center" o:hrstd="t" o:hr="t" fillcolor="#a0a0a0" stroked="f"/>
+          <v:rect id="_x0000_i1064" style="width:0;height:1.5pt" o:hralign="center" o:hrstd="t" o:hr="t" fillcolor="#a0a0a0" stroked="f"/>
         </w:pict>
       </w:r>
     </w:p>
@@ -35750,7 +35675,7 @@
           <w:szCs w:val="28"/>
         </w:rPr>
         <w:pict w14:anchorId="13A2E4E8">
-          <v:rect id="_x0000_i1031" style="width:0;height:1.5pt" o:hralign="center" o:hrstd="t" o:hr="t" fillcolor="#a0a0a0" stroked="f"/>
+          <v:rect id="_x0000_i1065" style="width:0;height:1.5pt" o:hralign="center" o:hrstd="t" o:hr="t" fillcolor="#a0a0a0" stroked="f"/>
         </w:pict>
       </w:r>
     </w:p>
@@ -35817,7 +35742,7 @@
           <w:szCs w:val="28"/>
         </w:rPr>
         <w:pict w14:anchorId="6B345353">
-          <v:rect id="_x0000_i1032" style="width:0;height:1.5pt" o:hralign="center" o:hrstd="t" o:hr="t" fillcolor="#a0a0a0" stroked="f"/>
+          <v:rect id="_x0000_i1066" style="width:0;height:1.5pt" o:hralign="center" o:hrstd="t" o:hr="t" fillcolor="#a0a0a0" stroked="f"/>
         </w:pict>
       </w:r>
     </w:p>
@@ -47869,6 +47794,7 @@
       </w:pPr>
       <w:r>
         <w:rPr>
+          <w:noProof/>
           <w:sz w:val="28"/>
           <w:szCs w:val="28"/>
         </w:rPr>
@@ -48694,7 +48620,7 @@
           <w:sz w:val="28"/>
           <w:szCs w:val="28"/>
         </w:rPr>
-        <w:t xml:space="preserve">Example: “User_ID” for </w:t>
+        <w:t>Example: “</w:t>
       </w:r>
       <w:proofErr w:type="spellStart"/>
       <w:r>
@@ -48702,6 +48628,22 @@
           <w:sz w:val="28"/>
           <w:szCs w:val="28"/>
         </w:rPr>
+        <w:t>User_ID</w:t>
+      </w:r>
+      <w:proofErr w:type="spellEnd"/>
+      <w:r>
+        <w:rPr>
+          <w:sz w:val="28"/>
+          <w:szCs w:val="28"/>
+        </w:rPr>
+        <w:t xml:space="preserve">” for </w:t>
+      </w:r>
+      <w:proofErr w:type="spellStart"/>
+      <w:r>
+        <w:rPr>
+          <w:sz w:val="28"/>
+          <w:szCs w:val="28"/>
+        </w:rPr>
         <w:t>a users</w:t>
       </w:r>
       <w:proofErr w:type="spellEnd"/>
@@ -48723,6 +48665,7 @@
       </w:pPr>
       <w:r>
         <w:rPr>
+          <w:noProof/>
           <w:sz w:val="28"/>
           <w:szCs w:val="28"/>
         </w:rPr>
@@ -48868,6 +48811,7 @@
       </w:pPr>
       <w:r>
         <w:rPr>
+          <w:noProof/>
           <w:sz w:val="28"/>
           <w:szCs w:val="28"/>
         </w:rPr>
@@ -49646,6 +49590,7 @@
       </w:pPr>
       <w:r>
         <w:rPr>
+          <w:noProof/>
           <w:sz w:val="28"/>
           <w:szCs w:val="28"/>
         </w:rPr>
@@ -49884,6 +49829,7 @@
       </w:pPr>
       <w:r>
         <w:rPr>
+          <w:noProof/>
           <w:sz w:val="28"/>
           <w:szCs w:val="28"/>
         </w:rPr>
@@ -50226,6 +50172,7 @@
       </w:r>
       <w:r>
         <w:rPr>
+          <w:noProof/>
           <w:sz w:val="28"/>
           <w:szCs w:val="28"/>
         </w:rPr>
@@ -50485,6 +50432,7 @@
       </w:pPr>
       <w:r>
         <w:rPr>
+          <w:noProof/>
           <w:sz w:val="28"/>
           <w:szCs w:val="28"/>
         </w:rPr>
@@ -51230,14 +51178,7 @@
           <w:sz w:val="28"/>
           <w:szCs w:val="28"/>
         </w:rPr>
-        <w:t>Amazon S3</w:t>
-      </w:r>
-      <w:r>
-        <w:rPr>
-          <w:sz w:val="28"/>
-          <w:szCs w:val="28"/>
-        </w:rPr>
-        <w:t xml:space="preserve"> Standard – Infrequent Access (IA) </w:t>
+        <w:t xml:space="preserve">Amazon S3 Standard – Infrequent Access (IA) </w:t>
       </w:r>
     </w:p>
     <w:p>
@@ -51257,14 +51198,7 @@
           <w:sz w:val="28"/>
           <w:szCs w:val="28"/>
         </w:rPr>
-        <w:t>Amazon S3</w:t>
-      </w:r>
-      <w:r>
-        <w:rPr>
-          <w:sz w:val="28"/>
-          <w:szCs w:val="28"/>
-        </w:rPr>
-        <w:t xml:space="preserve"> One Zone – Infrequent Access </w:t>
+        <w:t xml:space="preserve">Amazon S3 One Zone – Infrequent Access </w:t>
       </w:r>
     </w:p>
     <w:p>
@@ -51284,14 +51218,7 @@
           <w:sz w:val="28"/>
           <w:szCs w:val="28"/>
         </w:rPr>
-        <w:t>Amazon S3</w:t>
-      </w:r>
-      <w:r>
-        <w:rPr>
-          <w:sz w:val="28"/>
-          <w:szCs w:val="28"/>
-        </w:rPr>
-        <w:t xml:space="preserve"> Glacier Instant Retrieval </w:t>
+        <w:t xml:space="preserve">Amazon S3 Glacier Instant Retrieval </w:t>
       </w:r>
     </w:p>
     <w:p>
@@ -51311,14 +51238,7 @@
           <w:sz w:val="28"/>
           <w:szCs w:val="28"/>
         </w:rPr>
-        <w:t>Amazon S3</w:t>
-      </w:r>
-      <w:r>
-        <w:rPr>
-          <w:sz w:val="28"/>
-          <w:szCs w:val="28"/>
-        </w:rPr>
-        <w:t xml:space="preserve"> Glacier Flexible Retrieval </w:t>
+        <w:t xml:space="preserve">Amazon S3 Glacier Flexible Retrieval </w:t>
       </w:r>
     </w:p>
     <w:p>
@@ -51338,14 +51258,7 @@
           <w:sz w:val="28"/>
           <w:szCs w:val="28"/>
         </w:rPr>
-        <w:t>Amazon S3</w:t>
-      </w:r>
-      <w:r>
-        <w:rPr>
-          <w:sz w:val="28"/>
-          <w:szCs w:val="28"/>
-        </w:rPr>
-        <w:t xml:space="preserve"> Glacier Deep Archive</w:t>
+        <w:t>Amazon S3 Glacier Deep Archive</w:t>
       </w:r>
     </w:p>
     <w:p>
@@ -51365,14 +51278,7 @@
           <w:sz w:val="28"/>
           <w:szCs w:val="28"/>
         </w:rPr>
-        <w:t>Amazon S3</w:t>
-      </w:r>
-      <w:r>
-        <w:rPr>
-          <w:sz w:val="28"/>
-          <w:szCs w:val="28"/>
-        </w:rPr>
-        <w:t xml:space="preserve"> Intelligent Tiering</w:t>
+        <w:t>Amazon S3 Intelligent Tiering</w:t>
       </w:r>
     </w:p>
     <w:p>
@@ -51458,16 +51364,7 @@
           <w:sz w:val="28"/>
           <w:szCs w:val="28"/>
         </w:rPr>
-        <w:t xml:space="preserve">Amazon </w:t>
-      </w:r>
-      <w:r>
-        <w:rPr>
-          <w:b/>
-          <w:bCs/>
-          <w:sz w:val="28"/>
-          <w:szCs w:val="28"/>
-        </w:rPr>
-        <w:t xml:space="preserve">S3 Lifecycle Rules </w:t>
+        <w:t xml:space="preserve">Amazon S3 Lifecycle Rules </w:t>
       </w:r>
     </w:p>
     <w:p>
@@ -51671,6 +51568,493 @@
     </w:p>
     <w:p>
       <w:pPr>
+        <w:pStyle w:val="Heading2"/>
+        <w:rPr>
+          <w:sz w:val="28"/>
+          <w:szCs w:val="28"/>
+        </w:rPr>
+      </w:pPr>
+      <w:bookmarkStart w:id="70" w:name="_Toc230178463"/>
+      <w:r>
+        <w:rPr>
+          <w:sz w:val="28"/>
+          <w:szCs w:val="28"/>
+        </w:rPr>
+        <w:t>Introduction</w:t>
+      </w:r>
+      <w:bookmarkEnd w:id="70"/>
+    </w:p>
+    <w:p>
+      <w:pPr>
+        <w:rPr>
+          <w:sz w:val="28"/>
+          <w:szCs w:val="28"/>
+        </w:rPr>
+      </w:pPr>
+      <w:r>
+        <w:rPr>
+          <w:sz w:val="28"/>
+          <w:szCs w:val="28"/>
+        </w:rPr>
+        <w:t>Agentic AI refers to systems that not just generate responses, but also can reason, plan, take action, collaborate, and integrate with real tools and data across organisation.</w:t>
+      </w:r>
+    </w:p>
+    <w:p>
+      <w:pPr>
+        <w:rPr>
+          <w:sz w:val="28"/>
+          <w:szCs w:val="28"/>
+        </w:rPr>
+      </w:pPr>
+    </w:p>
+    <w:p>
+      <w:pPr>
+        <w:rPr>
+          <w:sz w:val="28"/>
+          <w:szCs w:val="28"/>
+        </w:rPr>
+      </w:pPr>
+      <w:r>
+        <w:rPr>
+          <w:sz w:val="28"/>
+          <w:szCs w:val="28"/>
+        </w:rPr>
+        <w:t xml:space="preserve">LLM Agents in Bedrock </w:t>
+      </w:r>
+    </w:p>
+    <w:p>
+      <w:pPr>
+        <w:rPr>
+          <w:sz w:val="28"/>
+          <w:szCs w:val="28"/>
+        </w:rPr>
+      </w:pPr>
+    </w:p>
+    <w:p>
+      <w:pPr>
+        <w:rPr>
+          <w:sz w:val="28"/>
+          <w:szCs w:val="28"/>
+        </w:rPr>
+      </w:pPr>
+      <w:r>
+        <w:rPr>
+          <w:sz w:val="28"/>
+          <w:szCs w:val="28"/>
+        </w:rPr>
+        <w:t xml:space="preserve">Hands ON: Amazon Bedrock Agents </w:t>
+      </w:r>
+    </w:p>
+    <w:p>
+      <w:pPr>
+        <w:rPr>
+          <w:sz w:val="28"/>
+          <w:szCs w:val="28"/>
+        </w:rPr>
+      </w:pPr>
+    </w:p>
+    <w:p>
+      <w:pPr>
+        <w:rPr>
+          <w:sz w:val="28"/>
+          <w:szCs w:val="28"/>
+        </w:rPr>
+      </w:pPr>
+      <w:r>
+        <w:rPr>
+          <w:sz w:val="28"/>
+          <w:szCs w:val="28"/>
+        </w:rPr>
+        <w:t xml:space="preserve">Multi-Agent Workflows </w:t>
+      </w:r>
+    </w:p>
+    <w:p>
+      <w:pPr>
+        <w:rPr>
+          <w:sz w:val="28"/>
+          <w:szCs w:val="28"/>
+        </w:rPr>
+      </w:pPr>
+    </w:p>
+    <w:p>
+      <w:pPr>
+        <w:rPr>
+          <w:sz w:val="28"/>
+          <w:szCs w:val="28"/>
+        </w:rPr>
+      </w:pPr>
+      <w:r>
+        <w:rPr>
+          <w:sz w:val="28"/>
+          <w:szCs w:val="28"/>
+        </w:rPr>
+        <w:t xml:space="preserve">Short and Long-Term Agent Memory </w:t>
+      </w:r>
+    </w:p>
+    <w:p>
+      <w:pPr>
+        <w:rPr>
+          <w:sz w:val="28"/>
+          <w:szCs w:val="28"/>
+        </w:rPr>
+      </w:pPr>
+    </w:p>
+    <w:p>
+      <w:pPr>
+        <w:rPr>
+          <w:sz w:val="28"/>
+          <w:szCs w:val="28"/>
+        </w:rPr>
+      </w:pPr>
+      <w:r>
+        <w:rPr>
+          <w:sz w:val="28"/>
+          <w:szCs w:val="28"/>
+        </w:rPr>
+        <w:t xml:space="preserve">Strands Agents </w:t>
+      </w:r>
+    </w:p>
+    <w:p>
+      <w:pPr>
+        <w:rPr>
+          <w:sz w:val="28"/>
+          <w:szCs w:val="28"/>
+        </w:rPr>
+      </w:pPr>
+    </w:p>
+    <w:p>
+      <w:pPr>
+        <w:rPr>
+          <w:sz w:val="28"/>
+          <w:szCs w:val="28"/>
+        </w:rPr>
+      </w:pPr>
+      <w:r>
+        <w:rPr>
+          <w:sz w:val="28"/>
+          <w:szCs w:val="28"/>
+        </w:rPr>
+        <w:t xml:space="preserve">Agent Squad </w:t>
+      </w:r>
+    </w:p>
+    <w:p>
+      <w:pPr>
+        <w:rPr>
+          <w:sz w:val="28"/>
+          <w:szCs w:val="28"/>
+        </w:rPr>
+      </w:pPr>
+    </w:p>
+    <w:p>
+      <w:pPr>
+        <w:rPr>
+          <w:sz w:val="28"/>
+          <w:szCs w:val="28"/>
+        </w:rPr>
+      </w:pPr>
+      <w:r>
+        <w:rPr>
+          <w:sz w:val="28"/>
+          <w:szCs w:val="28"/>
+        </w:rPr>
+        <w:t xml:space="preserve">Amazon </w:t>
+      </w:r>
+      <w:proofErr w:type="spellStart"/>
+      <w:r>
+        <w:rPr>
+          <w:sz w:val="28"/>
+          <w:szCs w:val="28"/>
+        </w:rPr>
+        <w:t>AgentCore</w:t>
+      </w:r>
+      <w:proofErr w:type="spellEnd"/>
+      <w:r>
+        <w:rPr>
+          <w:sz w:val="28"/>
+          <w:szCs w:val="28"/>
+        </w:rPr>
+        <w:t xml:space="preserve"> Introduction </w:t>
+      </w:r>
+    </w:p>
+    <w:p>
+      <w:pPr>
+        <w:rPr>
+          <w:sz w:val="28"/>
+          <w:szCs w:val="28"/>
+        </w:rPr>
+      </w:pPr>
+    </w:p>
+    <w:p>
+      <w:pPr>
+        <w:rPr>
+          <w:sz w:val="28"/>
+          <w:szCs w:val="28"/>
+        </w:rPr>
+      </w:pPr>
+      <w:proofErr w:type="spellStart"/>
+      <w:r>
+        <w:rPr>
+          <w:sz w:val="28"/>
+          <w:szCs w:val="28"/>
+        </w:rPr>
+        <w:t>AgentCore</w:t>
+      </w:r>
+      <w:proofErr w:type="spellEnd"/>
+      <w:r>
+        <w:rPr>
+          <w:sz w:val="28"/>
+          <w:szCs w:val="28"/>
+        </w:rPr>
+        <w:t xml:space="preserve"> Memory and Tools </w:t>
+      </w:r>
+    </w:p>
+    <w:p>
+      <w:pPr>
+        <w:rPr>
+          <w:sz w:val="28"/>
+          <w:szCs w:val="28"/>
+        </w:rPr>
+      </w:pPr>
+    </w:p>
+    <w:p>
+      <w:pPr>
+        <w:rPr>
+          <w:sz w:val="28"/>
+          <w:szCs w:val="28"/>
+        </w:rPr>
+      </w:pPr>
+      <w:proofErr w:type="spellStart"/>
+      <w:r>
+        <w:rPr>
+          <w:sz w:val="28"/>
+          <w:szCs w:val="28"/>
+        </w:rPr>
+        <w:t>AgentCore</w:t>
+      </w:r>
+      <w:proofErr w:type="spellEnd"/>
+      <w:r>
+        <w:rPr>
+          <w:sz w:val="28"/>
+          <w:szCs w:val="28"/>
+        </w:rPr>
+        <w:t xml:space="preserve"> Bedrock Import, Gateway, and Identity </w:t>
+      </w:r>
+    </w:p>
+    <w:p>
+      <w:pPr>
+        <w:rPr>
+          <w:sz w:val="28"/>
+          <w:szCs w:val="28"/>
+        </w:rPr>
+      </w:pPr>
+    </w:p>
+    <w:p>
+      <w:pPr>
+        <w:rPr>
+          <w:sz w:val="28"/>
+          <w:szCs w:val="28"/>
+        </w:rPr>
+      </w:pPr>
+      <w:proofErr w:type="spellStart"/>
+      <w:r>
+        <w:rPr>
+          <w:sz w:val="28"/>
+          <w:szCs w:val="28"/>
+        </w:rPr>
+        <w:t>AgentCore</w:t>
+      </w:r>
+      <w:proofErr w:type="spellEnd"/>
+      <w:r>
+        <w:rPr>
+          <w:sz w:val="28"/>
+          <w:szCs w:val="28"/>
+        </w:rPr>
+        <w:t xml:space="preserve"> Policies </w:t>
+      </w:r>
+    </w:p>
+    <w:p>
+      <w:pPr>
+        <w:rPr>
+          <w:sz w:val="28"/>
+          <w:szCs w:val="28"/>
+        </w:rPr>
+      </w:pPr>
+    </w:p>
+    <w:p>
+      <w:pPr>
+        <w:rPr>
+          <w:sz w:val="28"/>
+          <w:szCs w:val="28"/>
+        </w:rPr>
+      </w:pPr>
+      <w:proofErr w:type="spellStart"/>
+      <w:r>
+        <w:rPr>
+          <w:sz w:val="28"/>
+          <w:szCs w:val="28"/>
+        </w:rPr>
+        <w:t>AgentCore</w:t>
+      </w:r>
+      <w:proofErr w:type="spellEnd"/>
+      <w:r>
+        <w:rPr>
+          <w:sz w:val="28"/>
+          <w:szCs w:val="28"/>
+        </w:rPr>
+        <w:t xml:space="preserve"> Evaluators </w:t>
+      </w:r>
+    </w:p>
+    <w:p>
+      <w:pPr>
+        <w:rPr>
+          <w:sz w:val="28"/>
+          <w:szCs w:val="28"/>
+        </w:rPr>
+      </w:pPr>
+    </w:p>
+    <w:p>
+      <w:pPr>
+        <w:rPr>
+          <w:sz w:val="28"/>
+          <w:szCs w:val="28"/>
+        </w:rPr>
+      </w:pPr>
+      <w:r>
+        <w:rPr>
+          <w:sz w:val="28"/>
+          <w:szCs w:val="28"/>
+        </w:rPr>
+        <w:t xml:space="preserve">Model Context </w:t>
+      </w:r>
+      <w:proofErr w:type="gramStart"/>
+      <w:r>
+        <w:rPr>
+          <w:sz w:val="28"/>
+          <w:szCs w:val="28"/>
+        </w:rPr>
+        <w:t>Protocol(</w:t>
+      </w:r>
+      <w:proofErr w:type="gramEnd"/>
+      <w:r>
+        <w:rPr>
+          <w:sz w:val="28"/>
+          <w:szCs w:val="28"/>
+        </w:rPr>
+        <w:t xml:space="preserve">MCP) </w:t>
+      </w:r>
+    </w:p>
+    <w:p>
+      <w:pPr>
+        <w:rPr>
+          <w:sz w:val="28"/>
+          <w:szCs w:val="28"/>
+        </w:rPr>
+      </w:pPr>
+    </w:p>
+    <w:p>
+      <w:pPr>
+        <w:rPr>
+          <w:sz w:val="28"/>
+          <w:szCs w:val="28"/>
+        </w:rPr>
+      </w:pPr>
+      <w:proofErr w:type="spellStart"/>
+      <w:r>
+        <w:rPr>
+          <w:sz w:val="28"/>
+          <w:szCs w:val="28"/>
+        </w:rPr>
+        <w:t>OpenAPI</w:t>
+      </w:r>
+      <w:proofErr w:type="spellEnd"/>
+      <w:r>
+        <w:rPr>
+          <w:sz w:val="28"/>
+          <w:szCs w:val="28"/>
+        </w:rPr>
+        <w:t xml:space="preserve"> and Tool Usage</w:t>
+      </w:r>
+    </w:p>
+    <w:p>
+      <w:pPr>
+        <w:rPr>
+          <w:sz w:val="28"/>
+          <w:szCs w:val="28"/>
+        </w:rPr>
+      </w:pPr>
+    </w:p>
+    <w:p>
+      <w:pPr>
+        <w:rPr>
+          <w:sz w:val="28"/>
+          <w:szCs w:val="28"/>
+        </w:rPr>
+      </w:pPr>
+      <w:r>
+        <w:rPr>
+          <w:sz w:val="28"/>
+          <w:szCs w:val="28"/>
+        </w:rPr>
+        <w:t xml:space="preserve">Humans in the Loop </w:t>
+      </w:r>
+    </w:p>
+    <w:p>
+      <w:pPr>
+        <w:rPr>
+          <w:sz w:val="28"/>
+          <w:szCs w:val="28"/>
+        </w:rPr>
+      </w:pPr>
+    </w:p>
+    <w:p>
+      <w:pPr>
+        <w:rPr>
+          <w:sz w:val="28"/>
+          <w:szCs w:val="28"/>
+        </w:rPr>
+      </w:pPr>
+      <w:r>
+        <w:rPr>
+          <w:sz w:val="28"/>
+          <w:szCs w:val="28"/>
+        </w:rPr>
+        <w:t xml:space="preserve">Amazon Q Business </w:t>
+      </w:r>
+    </w:p>
+    <w:p>
+      <w:pPr>
+        <w:rPr>
+          <w:sz w:val="28"/>
+          <w:szCs w:val="28"/>
+        </w:rPr>
+      </w:pPr>
+    </w:p>
+    <w:p>
+      <w:pPr>
+        <w:rPr>
+          <w:sz w:val="28"/>
+          <w:szCs w:val="28"/>
+        </w:rPr>
+      </w:pPr>
+    </w:p>
+    <w:p>
+      <w:pPr>
+        <w:rPr>
+          <w:sz w:val="28"/>
+          <w:szCs w:val="28"/>
+        </w:rPr>
+      </w:pPr>
+    </w:p>
+    <w:p>
+      <w:pPr>
+        <w:rPr>
+          <w:sz w:val="28"/>
+          <w:szCs w:val="28"/>
+        </w:rPr>
+      </w:pPr>
+    </w:p>
+    <w:p>
+      <w:pPr>
         <w:rPr>
           <w:sz w:val="28"/>
           <w:szCs w:val="28"/>
@@ -51696,25 +52080,6 @@
     </w:p>
     <w:p>
       <w:pPr>
-        <w:pStyle w:val="Heading2"/>
-        <w:rPr>
-          <w:sz w:val="28"/>
-          <w:szCs w:val="28"/>
-        </w:rPr>
-      </w:pPr>
-      <w:bookmarkStart w:id="70" w:name="_Toc230178463"/>
-      <w:r>
-        <w:rPr>
-          <w:sz w:val="28"/>
-          <w:szCs w:val="28"/>
-        </w:rPr>
-        <w:lastRenderedPageBreak/>
-        <w:t>Introduction</w:t>
-      </w:r>
-      <w:bookmarkEnd w:id="70"/>
-    </w:p>
-    <w:p>
-      <w:pPr>
         <w:rPr>
           <w:rFonts w:asciiTheme="majorHAnsi" w:eastAsiaTheme="majorEastAsia" w:hAnsiTheme="majorHAnsi" w:cstheme="majorBidi"/>
           <w:color w:val="2F5496" w:themeColor="accent1" w:themeShade="BF"/>
@@ -51727,13 +52092,7 @@
           <w:sz w:val="28"/>
           <w:szCs w:val="28"/>
         </w:rPr>
-        <w:t xml:space="preserve">Agentic AI refers to systems that not just generate responses, but also can reason, plan, take action, collaborate, and integrate with real tools and data across organisation. </w:t>
-      </w:r>
-      <w:r>
-        <w:rPr>
-          <w:sz w:val="28"/>
-          <w:szCs w:val="28"/>
-        </w:rPr>
+        <w:lastRenderedPageBreak/>
         <w:br w:type="page"/>
       </w:r>
     </w:p>
@@ -51754,15 +52113,13 @@
         <w:lastRenderedPageBreak/>
         <w:t xml:space="preserve">Section 5: Operational </w:t>
       </w:r>
-      <w:proofErr w:type="gramStart"/>
-      <w:r>
-        <w:rPr>
-          <w:sz w:val="28"/>
-          <w:szCs w:val="28"/>
-        </w:rPr>
-        <w:t>Efficiency  and</w:t>
-      </w:r>
-      <w:proofErr w:type="gramEnd"/>
+      <w:r>
+        <w:rPr>
+          <w:sz w:val="28"/>
+          <w:szCs w:val="28"/>
+        </w:rPr>
+        <w:t>Efficiency and</w:t>
+      </w:r>
       <w:r>
         <w:rPr>
           <w:sz w:val="28"/>
@@ -67168,6 +67525,7 @@
   <w:style w:type="character" w:default="1" w:styleId="DefaultParagraphFont">
     <w:name w:val="Default Paragraph Font"/>
     <w:uiPriority w:val="1"/>
+    <w:semiHidden/>
     <w:unhideWhenUsed/>
   </w:style>
   <w:style w:type="table" w:default="1" w:styleId="TableNormal">

</xml_diff>